<commit_message>
Slide 4 added of Lab 4
</commit_message>
<xml_diff>
--- a/Ai Lab/Lab # 4 - DLS & IDS (8-Aug)/Lab # 4.docx
+++ b/Ai Lab/Lab # 4 - DLS & IDS (8-Aug)/Lab # 4.docx
@@ -5,6 +5,7 @@
     <w:p>
       <w:pPr>
         <w:keepNext/>
+        <w:ind w:firstLine="720"/>
         <w:jc w:val="center"/>
         <w:rPr>
           <w:b/>
@@ -763,7 +764,25 @@
           <w:bCs/>
           <w:lang w:val="en"/>
         </w:rPr>
-        <w:t>Suppose our goal is G, and if we are using DFS so it will first start with A-B-D-H, suppose if H has more connected nodes then will have stuck in loop and will never go to goal state.</w:t>
+        <w:t xml:space="preserve">Suppose our goal is G, and if we are using DFS so it will first start with A-B-D-H, suppose if H has more connected </w:t>
+      </w:r>
+      <w:proofErr w:type="gramStart"/>
+      <w:r>
+        <w:rPr>
+          <w:rFonts w:eastAsiaTheme="majorEastAsia"/>
+          <w:bCs/>
+          <w:lang w:val="en"/>
+        </w:rPr>
+        <w:t>nodes</w:t>
+      </w:r>
+      <w:proofErr w:type="gramEnd"/>
+      <w:r>
+        <w:rPr>
+          <w:rFonts w:eastAsiaTheme="majorEastAsia"/>
+          <w:bCs/>
+          <w:lang w:val="en"/>
+        </w:rPr>
+        <w:t xml:space="preserve"> then will have stuck in loop and will never go to goal state.</w:t>
       </w:r>
     </w:p>
     <w:p>
@@ -882,7 +901,21 @@
         <w:rPr>
           <w:lang w:val="en"/>
         </w:rPr>
-        <w:t>Here we will set the levels for nodes. And also set the limit such as limit =2 , so the advantage is the process will go till level 2 then it will stop where G our goal state is present, it will not search further.</w:t>
+        <w:t>Here we will set the levels for nodes. And also set the limit such as limit =</w:t>
+      </w:r>
+      <w:proofErr w:type="gramStart"/>
+      <w:r>
+        <w:rPr>
+          <w:lang w:val="en"/>
+        </w:rPr>
+        <w:t>2 ,</w:t>
+      </w:r>
+      <w:proofErr w:type="gramEnd"/>
+      <w:r>
+        <w:rPr>
+          <w:lang w:val="en"/>
+        </w:rPr>
+        <w:t xml:space="preserve"> so the advantage is the process will go till level 2 then it will stop where G our goal state is present, it will not search further.</w:t>
       </w:r>
     </w:p>
     <w:p>
@@ -1067,7 +1100,21 @@
         <w:rPr>
           <w:lang w:val="en"/>
         </w:rPr>
-        <w:t>As we know, if a node is popped then its child nodes come to stack in reverse order now we will have C, B in stack.</w:t>
+        <w:t xml:space="preserve">As we know, if a node is popped then its child nodes come to stack in reverse order </w:t>
+      </w:r>
+      <w:proofErr w:type="gramStart"/>
+      <w:r>
+        <w:rPr>
+          <w:lang w:val="en"/>
+        </w:rPr>
+        <w:t>now</w:t>
+      </w:r>
+      <w:proofErr w:type="gramEnd"/>
+      <w:r>
+        <w:rPr>
+          <w:lang w:val="en"/>
+        </w:rPr>
+        <w:t xml:space="preserve"> we will have C, B in stack.</w:t>
       </w:r>
     </w:p>
     <w:p>
@@ -1221,11 +1268,33 @@
           <w:lang w:val="en"/>
         </w:rPr>
       </w:pPr>
-      <w:r>
-        <w:rPr>
-          <w:lang w:val="en"/>
-        </w:rPr>
-        <w:t>Similarly D is popped and added in visited list, but remember we have set the limit to two so this algorithm will not go to H, and H will not be added in stack , rather it will go to E and pop E.</w:t>
+      <w:proofErr w:type="gramStart"/>
+      <w:r>
+        <w:rPr>
+          <w:lang w:val="en"/>
+        </w:rPr>
+        <w:t>Similarly</w:t>
+      </w:r>
+      <w:proofErr w:type="gramEnd"/>
+      <w:r>
+        <w:rPr>
+          <w:lang w:val="en"/>
+        </w:rPr>
+        <w:t xml:space="preserve"> D is popped and added in visited list, but remember we have set the limit to two so this algorithm will not go to H, and H will not be added in </w:t>
+      </w:r>
+      <w:proofErr w:type="gramStart"/>
+      <w:r>
+        <w:rPr>
+          <w:lang w:val="en"/>
+        </w:rPr>
+        <w:t>stack ,</w:t>
+      </w:r>
+      <w:proofErr w:type="gramEnd"/>
+      <w:r>
+        <w:rPr>
+          <w:lang w:val="en"/>
+        </w:rPr>
+        <w:t xml:space="preserve"> rather it will go to E and pop E.</w:t>
       </w:r>
     </w:p>
     <w:p>
@@ -1304,7 +1373,35 @@
         <w:rPr>
           <w:lang w:val="en"/>
         </w:rPr>
-        <w:t>Since e has no child so none of its child will be added in stack and it will move to C. C will be popped and added to visited list it’s childs will be added to stack.</w:t>
+        <w:t xml:space="preserve">Since </w:t>
+      </w:r>
+      <w:proofErr w:type="spellStart"/>
+      <w:r>
+        <w:rPr>
+          <w:lang w:val="en"/>
+        </w:rPr>
+        <w:t>e</w:t>
+      </w:r>
+      <w:proofErr w:type="spellEnd"/>
+      <w:r>
+        <w:rPr>
+          <w:lang w:val="en"/>
+        </w:rPr>
+        <w:t xml:space="preserve"> has no child so none of its child will be added in stack and it will move to C. C will be popped and added to visited list it’s </w:t>
+      </w:r>
+      <w:proofErr w:type="spellStart"/>
+      <w:r>
+        <w:rPr>
+          <w:lang w:val="en"/>
+        </w:rPr>
+        <w:t>childs</w:t>
+      </w:r>
+      <w:proofErr w:type="spellEnd"/>
+      <w:r>
+        <w:rPr>
+          <w:lang w:val="en"/>
+        </w:rPr>
+        <w:t xml:space="preserve"> will be added to stack.</w:t>
       </w:r>
     </w:p>
     <w:p>
@@ -1418,7 +1515,7 @@
           <w:noProof/>
         </w:rPr>
         <w:drawing>
-          <wp:inline distT="0" distB="0" distL="0" distR="0" wp14:anchorId="2988D5E4" wp14:editId="1D2490D7">
+          <wp:inline distT="0" distB="0" distL="0" distR="0" wp14:anchorId="2988D5E4" wp14:editId="1B72F95E">
             <wp:extent cx="3405116" cy="2167487"/>
             <wp:effectExtent l="19050" t="19050" r="24130" b="23495"/>
             <wp:docPr id="1628368115" name="Picture 18"/>
@@ -1610,11 +1707,19 @@
           <w:lang w:val="en"/>
         </w:rPr>
       </w:pPr>
-      <w:r>
-        <w:rPr>
-          <w:lang w:val="en"/>
-        </w:rPr>
-        <w:t xml:space="preserve">First we will make graph </w:t>
+      <w:proofErr w:type="gramStart"/>
+      <w:r>
+        <w:rPr>
+          <w:lang w:val="en"/>
+        </w:rPr>
+        <w:t>First</w:t>
+      </w:r>
+      <w:proofErr w:type="gramEnd"/>
+      <w:r>
+        <w:rPr>
+          <w:lang w:val="en"/>
+        </w:rPr>
+        <w:t xml:space="preserve"> we will make graph </w:t>
       </w:r>
     </w:p>
     <w:p>
@@ -1891,11 +1996,19 @@
           <w:lang w:val="en"/>
         </w:rPr>
       </w:pPr>
-      <w:r>
-        <w:rPr>
-          <w:lang w:val="en"/>
-        </w:rPr>
-        <w:t>So each item in the stack holds:</w:t>
+      <w:proofErr w:type="gramStart"/>
+      <w:r>
+        <w:rPr>
+          <w:lang w:val="en"/>
+        </w:rPr>
+        <w:t>So</w:t>
+      </w:r>
+      <w:proofErr w:type="gramEnd"/>
+      <w:r>
+        <w:rPr>
+          <w:lang w:val="en"/>
+        </w:rPr>
+        <w:t xml:space="preserve"> each item in the stack holds:</w:t>
       </w:r>
     </w:p>
     <w:p>
@@ -2069,11 +2182,19 @@
           <w:lang w:val="en"/>
         </w:rPr>
       </w:pPr>
-      <w:r>
-        <w:rPr>
-          <w:lang w:val="en"/>
-        </w:rPr>
-        <w:t xml:space="preserve">So when we have nodes in stack the algorithm will work </w:t>
+      <w:proofErr w:type="gramStart"/>
+      <w:r>
+        <w:rPr>
+          <w:lang w:val="en"/>
+        </w:rPr>
+        <w:t>So</w:t>
+      </w:r>
+      <w:proofErr w:type="gramEnd"/>
+      <w:r>
+        <w:rPr>
+          <w:lang w:val="en"/>
+        </w:rPr>
+        <w:t xml:space="preserve"> when we have nodes in stack the algorithm will work </w:t>
       </w:r>
     </w:p>
     <w:p>
@@ -2335,6 +2456,8 @@
           <w:lang w:val="en"/>
         </w:rPr>
       </w:pPr>
+      <w:proofErr w:type="spellStart"/>
+      <w:proofErr w:type="gramStart"/>
       <w:r>
         <w:rPr>
           <w:rFonts w:ascii="Courier New" w:eastAsiaTheme="majorEastAsia" w:hAnsi="Courier New" w:cs="Courier New"/>
@@ -2342,7 +2465,18 @@
           <w:szCs w:val="20"/>
           <w:lang w:val="en"/>
         </w:rPr>
-        <w:t>stack.append((child, depth + 1))</w:t>
+        <w:t>stack.append</w:t>
+      </w:r>
+      <w:proofErr w:type="spellEnd"/>
+      <w:proofErr w:type="gramEnd"/>
+      <w:r>
+        <w:rPr>
+          <w:rFonts w:ascii="Courier New" w:eastAsiaTheme="majorEastAsia" w:hAnsi="Courier New" w:cs="Courier New"/>
+          <w:sz w:val="20"/>
+          <w:szCs w:val="20"/>
+          <w:lang w:val="en"/>
+        </w:rPr>
+        <w:t>((child, depth + 1))</w:t>
       </w:r>
       <w:r>
         <w:rPr>
@@ -2873,7 +3007,21 @@
         <w:rPr>
           <w:lang w:val="en"/>
         </w:rPr>
-        <w:t>Here A is not our goal state so it will be added, in visited and its neighbours/ child will be added in stack which are B and C, and one limit is increased.</w:t>
+        <w:t xml:space="preserve">Here A is not our goal state so it will be added, in visited and its </w:t>
+      </w:r>
+      <w:proofErr w:type="spellStart"/>
+      <w:r>
+        <w:rPr>
+          <w:lang w:val="en"/>
+        </w:rPr>
+        <w:t>neighbours</w:t>
+      </w:r>
+      <w:proofErr w:type="spellEnd"/>
+      <w:r>
+        <w:rPr>
+          <w:lang w:val="en"/>
+        </w:rPr>
+        <w:t>/ child will be added in stack which are B and C, and one limit is increased.</w:t>
       </w:r>
     </w:p>
     <w:p>
@@ -3128,13 +3276,7 @@
         </w:numPr>
       </w:pPr>
       <w:r>
-        <w:t xml:space="preserve">Write a DLS program to find a path in the given graph </w:t>
-      </w:r>
-      <w:r>
-        <w:t>using a depth limit of 3</w:t>
-      </w:r>
-      <w:r>
-        <w:t>, and display the visited nodes.</w:t>
+        <w:t>Write a DLS program to find goal ‘G’ in the given graph using a depth limit of 2, and display the visited nodes.</w:t>
       </w:r>
     </w:p>
     <w:p>
@@ -3146,7 +3288,7 @@
         </w:numPr>
       </w:pPr>
       <w:r>
-        <w:t>Write an IDS program to find a path in the given graph by repeatedly applying DLS with increasing depth limits, and display the depth at which the goal is found.</w:t>
+        <w:t>Write an IDS program to find goal ‘G’ in the given graph by repeatedly applying DLS with increasing depth limits, and display the depth at which the goal ‘G’ is found.</w:t>
       </w:r>
     </w:p>
     <w:p/>
@@ -4005,7 +4147,7 @@
   <w:abstractNum w:abstractNumId="5" w15:restartNumberingAfterBreak="0">
     <w:nsid w:val="1EF97BBF"/>
     <w:multiLevelType w:val="hybridMultilevel"/>
-    <w:tmpl w:val="25069CD0"/>
+    <w:tmpl w:val="28FE00C2"/>
     <w:lvl w:ilvl="0" w:tplc="20000001">
       <w:start w:val="1"/>
       <w:numFmt w:val="bullet"/>
@@ -5951,7 +6093,6 @@
   <w:style w:type="character" w:default="1" w:styleId="DefaultParagraphFont">
     <w:name w:val="Default Paragraph Font"/>
     <w:uiPriority w:val="1"/>
-    <w:semiHidden/>
     <w:unhideWhenUsed/>
   </w:style>
   <w:style w:type="table" w:default="1" w:styleId="TableNormal">

</xml_diff>